<commit_message>
Sync resume CVs with main CV (2026-09-14)
cv-full.docx: replace with the current main CV (wshan.cv-20260914).
The previous file was a May 14, 2026 snapshot missing 5 conference
papers, 4 research projects, 3 invited talks and 2 journal editor
roles, and still carried the pre-2026-08-21 values (dbalab homepage
URL, Infonomics Special Guest Editor, CIKM 2009 Beijing, DASFAA 2014
workshop, old patent number notation). It also predated the layout
fixes, so it had no keepNext on section headings and still disabled
widow/orphan control in 36 places.

cv-short.docx: add the 5 recent conference papers (SIGMOD 2027 cache
replacement, CADENZA, TRACE, and the two VLDB 2026 demos), correct
CIKM 2009 to Hong Kong and the DASFAA 2014 keynote to the 19th DASFAA
main conference, and bump the cover date.

Co-Authored-By: Claude Opus 5 (1M context) <noreply@anthropic.com>
Claude-Session: https://claude.ai/code/session_017ectFUpn33Djo4WKnBbZzT
</commit_message>
<xml_diff>
--- a/resume/cv-short.docx
+++ b/resume/cv-short.docx
@@ -26,7 +26,7 @@
           <w:color w:val="000000"/>
           <w:szCs w:val="20"/>
         </w:rPr>
-        <w:t>August 29</w:t>
+        <w:t>September 14</w:t>
       </w:r>
       <w:r>
         <w:rPr>
@@ -42,7 +42,7 @@
           <w:color w:val="000000"/>
           <w:szCs w:val="20"/>
         </w:rPr>
-        <w:t>5</w:t>
+        <w:t>6</w:t>
       </w:r>
     </w:p>
     <w:p>
@@ -2701,7 +2701,7 @@
           <w:sz w:val="16"/>
           <w:szCs w:val="16"/>
         </w:rPr>
-        <w:t>Workshop Co-chair, ACM 18th Conf. on Information and Knowledge Management (ACM CIKM), Beijing, China, Oct. 2009</w:t>
+        <w:t>Workshop Co-chair, ACM 18th Conf. on Information and Knowledge Management (ACM CIKM), Hong Kong, China, Oct. 2009</w:t>
       </w:r>
     </w:p>
     <w:p>
@@ -3270,6 +3270,181 @@
           <w:szCs w:val="16"/>
         </w:rPr>
         <w:t>Publications</w:t>
+      </w:r>
+    </w:p>
+    <w:p>
+      <w:pPr>
+        <w:numPr>
+          <w:ilvl w:val="0"/>
+          <w:numId w:val="1"/>
+        </w:numPr>
+        <w:pBdr>
+          <w:top w:val="nil"/>
+          <w:left w:val="nil"/>
+          <w:bottom w:val="nil"/>
+          <w:right w:val="nil"/>
+          <w:between w:val="nil"/>
+        </w:pBdr>
+        <w:tabs>
+          <w:tab w:val="left" w:pos="448"/>
+        </w:tabs>
+        <w:spacing w:line="240" w:lineRule="auto"/>
+        <w:ind w:left="0" w:hanging="2"/>
+        <w:rPr>
+          <w:rFonts w:ascii="Times New Roman" w:eastAsia="Times New Roman"/>
+          <w:color w:val="000000"/>
+          <w:sz w:val="16"/>
+          <w:szCs w:val="16"/>
+        </w:rPr>
+      </w:pPr>
+      <w:r>
+        <w:rPr>
+          <w:rFonts w:ascii="Times New Roman" w:eastAsia="Times New Roman" w:hint="eastAsia"/>
+          <w:color w:val="000000"/>
+          <w:sz w:val="16"/>
+          <w:szCs w:val="16"/>
+        </w:rPr>
+        <w:t xml:space="preserve">Yoon, T., Lee, T., Lee, J., Kim, K., Tak, B., and Han, W., “Cache Replacement in Direct-Access Cloud OLAP—An Experimental Comparison and Practical Guidance,” In 53rd Int’l Conf. on Management of Data, ACM SIGMOD, Huntington Beach, CA, USA, June 2027. (corresponding author)</w:t>
+      </w:r>
+    </w:p>
+    <w:p>
+      <w:pPr>
+        <w:numPr>
+          <w:ilvl w:val="0"/>
+          <w:numId w:val="1"/>
+        </w:numPr>
+        <w:pBdr>
+          <w:top w:val="nil"/>
+          <w:left w:val="nil"/>
+          <w:bottom w:val="nil"/>
+          <w:right w:val="nil"/>
+          <w:between w:val="nil"/>
+        </w:pBdr>
+        <w:tabs>
+          <w:tab w:val="left" w:pos="448"/>
+        </w:tabs>
+        <w:spacing w:line="240" w:lineRule="auto"/>
+        <w:ind w:left="0" w:hanging="2"/>
+        <w:rPr>
+          <w:rFonts w:ascii="Times New Roman" w:eastAsia="Times New Roman"/>
+          <w:color w:val="000000"/>
+          <w:sz w:val="16"/>
+          <w:szCs w:val="16"/>
+        </w:rPr>
+      </w:pPr>
+      <w:r>
+        <w:rPr>
+          <w:rFonts w:ascii="Times New Roman" w:eastAsia="Times New Roman" w:hint="eastAsia"/>
+          <w:color w:val="000000"/>
+          <w:sz w:val="16"/>
+          <w:szCs w:val="16"/>
+        </w:rPr>
+        <w:t xml:space="preserve">Ha, J., Park, Y., and Han, W., “CADENZA: Compiling Natural-Language Intent into Task-Specific Operator DAGs for Semantic Query Processing,” In 53rd Int’l Conf. on Management of Data, ACM SIGMOD, Huntington Beach, CA, USA, June 2027. (corresponding author)</w:t>
+      </w:r>
+    </w:p>
+    <w:p>
+      <w:pPr>
+        <w:numPr>
+          <w:ilvl w:val="0"/>
+          <w:numId w:val="1"/>
+        </w:numPr>
+        <w:pBdr>
+          <w:top w:val="nil"/>
+          <w:left w:val="nil"/>
+          <w:bottom w:val="nil"/>
+          <w:right w:val="nil"/>
+          <w:between w:val="nil"/>
+        </w:pBdr>
+        <w:tabs>
+          <w:tab w:val="left" w:pos="448"/>
+        </w:tabs>
+        <w:spacing w:line="240" w:lineRule="auto"/>
+        <w:ind w:left="0" w:hanging="2"/>
+        <w:rPr>
+          <w:rFonts w:ascii="Times New Roman" w:eastAsia="Times New Roman"/>
+          <w:color w:val="000000"/>
+          <w:sz w:val="16"/>
+          <w:szCs w:val="16"/>
+        </w:rPr>
+      </w:pPr>
+      <w:r>
+        <w:rPr>
+          <w:rFonts w:ascii="Times New Roman" w:eastAsia="Times New Roman" w:hint="eastAsia"/>
+          <w:color w:val="000000"/>
+          <w:sz w:val="16"/>
+          <w:szCs w:val="16"/>
+        </w:rPr>
+        <w:t xml:space="preserve">Cha, S., Park, S., and Han, W., “TRACE: Table–Text Relationalization and Completion of Evidence for Coverage-Sensitive QA,” In Proc., the 2026 Conference on Empirical Methods in Natural Language Processing, EMNLP, Budapest, Hungary, October 2026. (corresponding author)</w:t>
+      </w:r>
+    </w:p>
+    <w:p>
+      <w:pPr>
+        <w:numPr>
+          <w:ilvl w:val="0"/>
+          <w:numId w:val="1"/>
+        </w:numPr>
+        <w:pBdr>
+          <w:top w:val="nil"/>
+          <w:left w:val="nil"/>
+          <w:bottom w:val="nil"/>
+          <w:right w:val="nil"/>
+          <w:between w:val="nil"/>
+        </w:pBdr>
+        <w:tabs>
+          <w:tab w:val="left" w:pos="448"/>
+        </w:tabs>
+        <w:spacing w:line="240" w:lineRule="auto"/>
+        <w:ind w:left="0" w:hanging="2"/>
+        <w:rPr>
+          <w:rFonts w:ascii="Times New Roman" w:eastAsia="Times New Roman"/>
+          <w:color w:val="000000"/>
+          <w:sz w:val="16"/>
+          <w:szCs w:val="16"/>
+        </w:rPr>
+      </w:pPr>
+      <w:r>
+        <w:rPr>
+          <w:rFonts w:ascii="Times New Roman" w:eastAsia="Times New Roman" w:hint="eastAsia"/>
+          <w:color w:val="000000"/>
+          <w:sz w:val="16"/>
+          <w:szCs w:val="16"/>
+        </w:rPr>
+        <w:t xml:space="preserve">Ha, J., Park, Y., and Han, W., “CADENZA in Action: Breaking the Monolith with Intent-Dependent Plan Spaces for Semantic Queries,” In 52nd Int’l Conf. on Very Large Data Bases (VLDB) / Proc. the VLDB Endowment (PVLDB), Boston, MA, US, August 2026. (demo) (corresponding author)</w:t>
+      </w:r>
+    </w:p>
+    <w:p>
+      <w:pPr>
+        <w:numPr>
+          <w:ilvl w:val="0"/>
+          <w:numId w:val="1"/>
+        </w:numPr>
+        <w:pBdr>
+          <w:top w:val="nil"/>
+          <w:left w:val="nil"/>
+          <w:bottom w:val="nil"/>
+          <w:right w:val="nil"/>
+          <w:between w:val="nil"/>
+        </w:pBdr>
+        <w:tabs>
+          <w:tab w:val="left" w:pos="448"/>
+        </w:tabs>
+        <w:spacing w:line="240" w:lineRule="auto"/>
+        <w:ind w:left="0" w:hanging="2"/>
+        <w:rPr>
+          <w:rFonts w:ascii="Times New Roman" w:eastAsia="Times New Roman"/>
+          <w:color w:val="000000"/>
+          <w:sz w:val="16"/>
+          <w:szCs w:val="16"/>
+        </w:rPr>
+      </w:pPr>
+      <w:r>
+        <w:rPr>
+          <w:rFonts w:ascii="Times New Roman" w:eastAsia="Times New Roman" w:hint="eastAsia"/>
+          <w:color w:val="000000"/>
+          <w:sz w:val="16"/>
+          <w:szCs w:val="16"/>
+        </w:rPr>
+        <w:t xml:space="preserve">Lee, T., Ha, J., Tak, B., and Han, W., “TurboLynx in Action: A Schemaless Graph Engine for General-Purpose Analytics,” In 52nd Int’l Conf. on Very Large Data Bases (VLDB) / Proc. the VLDB Endowment (PVLDB), Boston, MA, US, August 2026. (demo) (co-corresponding author)</w:t>
       </w:r>
     </w:p>
     <w:p>
@@ -10590,7 +10765,7 @@
           <w:sz w:val="16"/>
           <w:szCs w:val="16"/>
         </w:rPr>
-        <w:t>Big Graph Data Processing, the 2nd International DASFAA Workshop on Big Data Management and Analytics, Bali, Indonesia, Apr. 21, 2014.</w:t>
+        <w:t>Big Graph Data Processing, the 19th International Conference on Database Systems for Advanced Applications (DASFAA), Bali, Indonesia, Apr. 21, 2014.</w:t>
       </w:r>
     </w:p>
     <w:sectPr>

</xml_diff>

<commit_message>
about/cv-short: add ICLR 2026/2025, mark WWW 2013 as demo; about: add KNU Best Teaching Awards, merge split EDB 2013 line, fix typos
Co-Authored-By: Claude Opus 5.5 <noreply@anthropic.com>
</commit_message>
<xml_diff>
--- a/resume/cv-short.docx
+++ b/resume/cv-short.docx
@@ -2957,7 +2957,7 @@
           <w:sz w:val="16"/>
           <w:szCs w:val="16"/>
         </w:rPr>
-        <w:t>WWW: 2019, 2013, 2012, 2011</w:t>
+        <w:t>WWW: 2019, 2013 (demo), 2012, 2011</w:t>
       </w:r>
     </w:p>
     <w:p>
@@ -3171,6 +3171,42 @@
           <w:szCs w:val="16"/>
         </w:rPr>
         <w:t xml:space="preserve">ICML: 2026</w:t>
+      </w:r>
+    </w:p>
+    <w:p>
+      <w:pPr>
+        <w:pStyle w:val="ac"/>
+        <w:numPr>
+          <w:ilvl w:val="0"/>
+          <w:numId w:val="3"/>
+        </w:numPr>
+        <w:pBdr>
+          <w:top w:val="nil"/>
+          <w:left w:val="nil"/>
+          <w:bottom w:val="nil"/>
+          <w:right w:val="nil"/>
+          <w:between w:val="nil"/>
+        </w:pBdr>
+        <w:tabs>
+          <w:tab w:val="left" w:pos="1440"/>
+        </w:tabs>
+        <w:spacing w:line="240" w:lineRule="auto"/>
+        <w:ind w:leftChars="0" w:firstLineChars="0"/>
+        <w:rPr>
+          <w:rFonts w:ascii="Times New Roman" w:eastAsia="Times New Roman"/>
+          <w:color w:val="000000"/>
+          <w:sz w:val="16"/>
+          <w:szCs w:val="16"/>
+        </w:rPr>
+      </w:pPr>
+      <w:r>
+        <w:rPr>
+          <w:rFonts w:ascii="Times New Roman" w:eastAsia="Times New Roman"/>
+          <w:color w:val="000000"/>
+          <w:sz w:val="16"/>
+          <w:szCs w:val="16"/>
+        </w:rPr>
+        <w:t>ICLR: 2026, 2025</w:t>
       </w:r>
     </w:p>
     <w:p>

</xml_diff>